<commit_message>
fix: update execution counts in Jupyter notebook cells and change kernel display name
</commit_message>
<xml_diff>
--- a/docs/report/รายงาน Mini Project - พรุ่งนี้น้ำจะท่วมไหมนะ.docx
+++ b/docs/report/รายงาน Mini Project - พรุ่งนี้น้ำจะท่วมไหมนะ.docx
@@ -387,11 +387,7 @@
           <w:hyperlink w:history="1" w:anchor="_Toc1">
             <w:r>
               <w:t xml:space="preserve">สารบัญ</w:t>
-            </w:r>
-            <w:r>
               <w:tab/>
-            </w:r>
-            <w:r>
               <w:fldChar w:fldCharType="begin" w:dirty="true"/>
               <w:instrText xml:space="preserve">PAGEREF _Toc1 \h</w:instrText>
               <w:fldChar w:fldCharType="separate"/>
@@ -409,11 +405,7 @@
           <w:hyperlink w:history="1" w:anchor="_Toc2">
             <w:r>
               <w:t xml:space="preserve">1. ที่มาและความสำคัญ</w:t>
-            </w:r>
-            <w:r>
               <w:tab/>
-            </w:r>
-            <w:r>
               <w:fldChar w:fldCharType="begin" w:dirty="true"/>
               <w:instrText xml:space="preserve">PAGEREF _Toc2 \h</w:instrText>
               <w:fldChar w:fldCharType="separate"/>
@@ -431,11 +423,7 @@
           <w:hyperlink w:history="1" w:anchor="_Toc3">
             <w:r>
               <w:t xml:space="preserve">2. แนวคิดและแนวทางการแก้ปัญหา (Solution)</w:t>
-            </w:r>
-            <w:r>
               <w:tab/>
-            </w:r>
-            <w:r>
               <w:fldChar w:fldCharType="begin" w:dirty="true"/>
               <w:instrText xml:space="preserve">PAGEREF _Toc3 \h</w:instrText>
               <w:fldChar w:fldCharType="separate"/>
@@ -453,11 +441,7 @@
           <w:hyperlink w:history="1" w:anchor="_Toc4">
             <w:r>
               <w:t xml:space="preserve">3. วิธีการดำเนินงานและออกแบบ</w:t>
-            </w:r>
-            <w:r>
               <w:tab/>
-            </w:r>
-            <w:r>
               <w:fldChar w:fldCharType="begin" w:dirty="true"/>
               <w:instrText xml:space="preserve">PAGEREF _Toc4 \h</w:instrText>
               <w:fldChar w:fldCharType="separate"/>
@@ -476,11 +460,7 @@
           <w:hyperlink w:history="1" w:anchor="_Toc5">
             <w:r>
               <w:t xml:space="preserve">3.1 ขั้นตอนและกระบวนการทำงานของโครงการ</w:t>
-            </w:r>
-            <w:r>
               <w:tab/>
-            </w:r>
-            <w:r>
               <w:fldChar w:fldCharType="begin" w:dirty="true"/>
               <w:instrText xml:space="preserve">PAGEREF _Toc5 \h</w:instrText>
               <w:fldChar w:fldCharType="separate"/>
@@ -499,11 +479,7 @@
           <w:hyperlink w:history="1" w:anchor="_Toc6">
             <w:r>
               <w:t xml:space="preserve">3.2 Flow หรือ Workflow ของระบบ</w:t>
-            </w:r>
-            <w:r>
               <w:tab/>
-            </w:r>
-            <w:r>
               <w:fldChar w:fldCharType="begin" w:dirty="true"/>
               <w:instrText xml:space="preserve">PAGEREF _Toc6 \h</w:instrText>
               <w:fldChar w:fldCharType="separate"/>
@@ -522,11 +498,7 @@
           <w:hyperlink w:history="1" w:anchor="_Toc7">
             <w:r>
               <w:t xml:space="preserve">3.3 การออกแบบระบบและองค์ประกอบต่าง ๆ</w:t>
-            </w:r>
-            <w:r>
               <w:tab/>
-            </w:r>
-            <w:r>
               <w:fldChar w:fldCharType="begin" w:dirty="true"/>
               <w:instrText xml:space="preserve">PAGEREF _Toc7 \h</w:instrText>
               <w:fldChar w:fldCharType="separate"/>
@@ -545,11 +517,7 @@
           <w:hyperlink w:history="1" w:anchor="_Toc8">
             <w:r>
               <w:t xml:space="preserve">3.4 การออกแบบและพัฒนา AI/ML Model</w:t>
-            </w:r>
-            <w:r>
               <w:tab/>
-            </w:r>
-            <w:r>
               <w:fldChar w:fldCharType="begin" w:dirty="true"/>
               <w:instrText xml:space="preserve">PAGEREF _Toc8 \h</w:instrText>
               <w:fldChar w:fldCharType="separate"/>
@@ -568,11 +536,7 @@
           <w:hyperlink w:history="1" w:anchor="_Toc9">
             <w:r>
               <w:t xml:space="preserve">3.5 เครื่องมือ เทคโนโลยี และ Dataset ที่ใช้</w:t>
-            </w:r>
-            <w:r>
               <w:tab/>
-            </w:r>
-            <w:r>
               <w:fldChar w:fldCharType="begin" w:dirty="true"/>
               <w:instrText xml:space="preserve">PAGEREF _Toc9 \h</w:instrText>
               <w:fldChar w:fldCharType="separate"/>
@@ -590,11 +554,7 @@
           <w:hyperlink w:history="1" w:anchor="_Toc10">
             <w:r>
               <w:t xml:space="preserve">4. ผลการดำเนินงานและการวิเคราะห์ผล (Results &amp; Analysis)</w:t>
-            </w:r>
-            <w:r>
               <w:tab/>
-            </w:r>
-            <w:r>
               <w:fldChar w:fldCharType="begin" w:dirty="true"/>
               <w:instrText xml:space="preserve">PAGEREF _Toc10 \h</w:instrText>
               <w:fldChar w:fldCharType="separate"/>
@@ -613,11 +573,7 @@
           <w:hyperlink w:history="1" w:anchor="_Toc11">
             <w:r>
               <w:t xml:space="preserve">4.1 ผลลัพธ์ที่ได้จากการพัฒนา</w:t>
-            </w:r>
-            <w:r>
               <w:tab/>
-            </w:r>
-            <w:r>
               <w:fldChar w:fldCharType="begin" w:dirty="true"/>
               <w:instrText xml:space="preserve">PAGEREF _Toc11 \h</w:instrText>
               <w:fldChar w:fldCharType="separate"/>
@@ -636,11 +592,7 @@
           <w:hyperlink w:history="1" w:anchor="_Toc12">
             <w:r>
               <w:t xml:space="preserve">4.2 การทดสอบและตัวชี้วัดที่ใช้ประเมินผล</w:t>
-            </w:r>
-            <w:r>
               <w:tab/>
-            </w:r>
-            <w:r>
               <w:fldChar w:fldCharType="begin" w:dirty="true"/>
               <w:instrText xml:space="preserve">PAGEREF _Toc12 \h</w:instrText>
               <w:fldChar w:fldCharType="separate"/>
@@ -659,11 +611,7 @@
           <w:hyperlink w:history="1" w:anchor="_Toc13">
             <w:r>
               <w:t xml:space="preserve">4.3 วิเคราะห์ว่าผลลัพธ์เป็นไปตามเป้าหมายหรือไม่</w:t>
-            </w:r>
-            <w:r>
               <w:tab/>
-            </w:r>
-            <w:r>
               <w:fldChar w:fldCharType="begin" w:dirty="true"/>
               <w:instrText xml:space="preserve">PAGEREF _Toc13 \h</w:instrText>
               <w:fldChar w:fldCharType="separate"/>
@@ -682,11 +630,7 @@
           <w:hyperlink w:history="1" w:anchor="_Toc14">
             <w:r>
               <w:t xml:space="preserve">4.4 ปัญหา ข้อจำกัด และสิ่งที่สามารถพัฒนาต่อได้</w:t>
-            </w:r>
-            <w:r>
               <w:tab/>
-            </w:r>
-            <w:r>
               <w:fldChar w:fldCharType="begin" w:dirty="true"/>
               <w:instrText xml:space="preserve">PAGEREF _Toc14 \h</w:instrText>
               <w:fldChar w:fldCharType="separate"/>
@@ -704,11 +648,7 @@
           <w:hyperlink w:history="1" w:anchor="_Toc15">
             <w:r>
               <w:t xml:space="preserve">เอกสารอ้างอิง</w:t>
-            </w:r>
-            <w:r>
               <w:tab/>
-            </w:r>
-            <w:r>
               <w:fldChar w:fldCharType="begin" w:dirty="true"/>
               <w:instrText xml:space="preserve">PAGEREF _Toc15 \h</w:instrText>
               <w:fldChar w:fldCharType="separate"/>
@@ -4474,6 +4414,64 @@
                 <w:szCs w:val="32"/>
               </w:rPr>
               <w:t xml:space="preserve">ขอบเขตน้ำท่วมจริงจากภาพดาวเทียมมีแค่เหตุการณ์ พ.ย. 2568 เหตุการณ์เดียว ทำให้สมมติฐานเส้นตรงของระดับน้ำวิกฤตยังไม่ถูกตรวจสอบกับเหตุการณ์อื่น</w:t>
+            </w:r>
+          </w:p>
+        </w:tc>
+      </w:tr>
+      <w:tr>
+        <w:tc>
+          <w:tcPr>
+            <w:tcW w:type="dxa" w:w="2800"/>
+            <w:tcMar>
+              <w:top w:type="dxa" w:w="80"/>
+              <w:left w:type="dxa" w:w="100"/>
+              <w:bottom w:type="dxa" w:w="80"/>
+              <w:right w:type="dxa" w:w="100"/>
+            </w:tcMar>
+            <w:vAlign w:val="center"/>
+          </w:tcPr>
+          <w:p>
+            <w:pPr>
+              <w:spacing w:after="0" w:line="360" w:lineRule="auto"/>
+              <w:jc w:val="left"/>
+            </w:pPr>
+            <w:r>
+              <w:rPr>
+                <w:rFonts w:ascii="TH Sarabun New" w:cs="TH Sarabun New" w:eastAsia="TH Sarabun New" w:hAnsi="TH Sarabun New"/>
+                <w:i w:val="false"/>
+                <w:iCs w:val="false"/>
+                <w:sz w:val="32"/>
+                <w:szCs w:val="32"/>
+              </w:rPr>
+              <w:t xml:space="preserve">ใช้สถานีวัดน้ำจุดเดียว (X.44) แทนความรุนแรงทั้งอำเภอ</w:t>
+            </w:r>
+          </w:p>
+        </w:tc>
+        <w:tc>
+          <w:tcPr>
+            <w:tcW w:type="dxa" w:w="6226"/>
+            <w:tcMar>
+              <w:top w:type="dxa" w:w="80"/>
+              <w:left w:type="dxa" w:w="100"/>
+              <w:bottom w:type="dxa" w:w="80"/>
+              <w:right w:type="dxa" w:w="100"/>
+            </w:tcMar>
+            <w:vAlign w:val="center"/>
+          </w:tcPr>
+          <w:p>
+            <w:pPr>
+              <w:spacing w:after="0" w:line="360" w:lineRule="auto"/>
+              <w:jc w:val="center"/>
+            </w:pPr>
+            <w:r>
+              <w:rPr>
+                <w:rFonts w:ascii="TH Sarabun New" w:cs="TH Sarabun New" w:eastAsia="TH Sarabun New" w:hAnsi="TH Sarabun New"/>
+                <w:i w:val="false"/>
+                <w:iCs w:val="false"/>
+                <w:sz w:val="32"/>
+                <w:szCs w:val="32"/>
+              </w:rPr>
+              <w:t xml:space="preserve">ระดับน้ำ X.44 ใช้เป็นดัชนีความรุนแรงของเหตุการณ์ทั้งอำเภอ ไม่ใช่ตัวขับเคลื่อนเชิงฟิสิกส์ที่ไหลไปท่วมแต่ละโซนโดยตรง ใช้ได้ดีกับน้ำท่วมจากฝนตกทั้งลุ่มน้ำแบบเหตุการณ์ พ.ย. 2568 ที่ X.44 ขึ้นพร้อมกับน้ำท่วมทั้งเมือง แต่ไม่ครอบคลุมน้ำท่วมจากฝนตกเฉพาะจุด (pluvial) ที่ระบายไม่ทันโดยที่ X.44 ไม่ขึ้นสูง</w:t>
             </w:r>
           </w:p>
         </w:tc>

</xml_diff>

<commit_message>
fix: update Mini Project report document
</commit_message>
<xml_diff>
--- a/docs/report/รายงาน Mini Project - พรุ่งนี้น้ำจะท่วมไหมนะ.docx
+++ b/docs/report/รายงาน Mini Project - พรุ่งนี้น้ำจะท่วมไหมนะ.docx
@@ -5260,6 +5260,35 @@
           <w:szCs w:val="32"/>
         </w:rPr>
         <w:t>วันที่ข้อมูลโทรมาตรต้นน้ำให้ได้ ส่วนการแปลงเป็นแผนที่รายโซนทำให้ประชาชนในแต่ละพื้นที่เห็นความเสี่ยง เฉพาะจุดของตนเอง แทนที่จะเห็นเพียงตัวเลขระดับน้ำที่สถานีเดียวซึ่งตีความยากสำหรับผู้ไม่มีความรู้ด้านอุทกวิทยา</w:t>
+      </w:r>
+    </w:p>
+    <w:p>
+      <w:pPr>
+        <w:pStyle w:val="Heading1"/>
+        <w:spacing w:lineRule="auto" w:line="240" w:before="360" w:after="200"/>
+        <w:rPr>
+          <w:rFonts w:eastAsia="TH Sarabun New" w:cs="TH Sarabun New"/>
+          <w:b/>
+          <w:bCs/>
+          <w:i w:val="false"/>
+          <w:iCs w:val="false"/>
+          <w:sz w:val="40"/>
+          <w:szCs w:val="40"/>
+        </w:rPr>
+      </w:pPr>
+      <w:r>
+        <w:rPr>
+          <w:rFonts w:eastAsia="TH Sarabun New" w:cs="TH Sarabun New"/>
+          <w:b/>
+          <w:bCs/>
+          <w:i w:val="false"/>
+          <w:iCs w:val="false"/>
+          <w:sz w:val="40"/>
+          <w:szCs w:val="40"/>
+        </w:rPr>
+      </w:r>
+      <w:r>
+        <w:br w:type="page"/>
       </w:r>
     </w:p>
     <w:p>
@@ -33112,6 +33141,35 @@
           <w:szCs w:val="28"/>
         </w:rPr>
         <w:t>แหล่งข้อมูลที่ใช้</w:t>
+      </w:r>
+    </w:p>
+    <w:p>
+      <w:pPr>
+        <w:pStyle w:val="Heading1"/>
+        <w:spacing w:lineRule="auto" w:line="240" w:before="360" w:after="200"/>
+        <w:rPr>
+          <w:rFonts w:eastAsia="TH Sarabun New" w:cs="TH Sarabun New"/>
+          <w:b/>
+          <w:bCs/>
+          <w:i w:val="false"/>
+          <w:iCs w:val="false"/>
+          <w:sz w:val="40"/>
+          <w:szCs w:val="40"/>
+        </w:rPr>
+      </w:pPr>
+      <w:r>
+        <w:rPr>
+          <w:rFonts w:eastAsia="TH Sarabun New" w:cs="TH Sarabun New"/>
+          <w:b/>
+          <w:bCs/>
+          <w:i w:val="false"/>
+          <w:iCs w:val="false"/>
+          <w:sz w:val="40"/>
+          <w:szCs w:val="40"/>
+        </w:rPr>
+      </w:r>
+      <w:r>
+        <w:br w:type="page"/>
       </w:r>
     </w:p>
     <w:p>

</xml_diff>

<commit_message>
feat: add new assets and update document formats in poster and report directories
</commit_message>
<xml_diff>
--- a/docs/report/รายงาน Mini Project - พรุ่งนี้น้ำจะท่วมไหมนะ.docx
+++ b/docs/report/รายงาน Mini Project - พรุ่งนี้น้ำจะท่วมไหมนะ.docx
@@ -170,6 +170,32 @@
           <w:bCs/>
           <w:i w:val="false"/>
           <w:iCs w:val="false"/>
+          <w:sz w:val="36"/>
+          <w:szCs w:val="36"/>
+        </w:rPr>
+        <w:t>พรุ่งนี้น้ำจะท่วมไหมนะ</w:t>
+      </w:r>
+      <w:r>
+        <w:rPr>
+          <w:rFonts w:eastAsia="TH Sarabun New"/>
+          <w:b/>
+          <w:bCs/>
+          <w:i w:val="false"/>
+          <w:iCs w:val="false"/>
+          <w:sz w:val="36"/>
+          <w:szCs w:val="36"/>
+        </w:rPr>
+        <w:t>?</w:t>
+        <w:br/>
+      </w:r>
+      <w:r>
+        <w:rPr>
+          <w:rFonts w:ascii="TH Sarabun New" w:hAnsi="TH Sarabun New" w:eastAsia="TH Sarabun New"/>
+          <w:b/>
+          <w:b/>
+          <w:bCs/>
+          <w:i w:val="false"/>
+          <w:iCs w:val="false"/>
           <w:color w:themeColor="text1" w:val="000000"/>
           <w:sz w:val="36"/>
           <w:szCs w:val="36"/>
@@ -732,29 +758,6 @@
         <w:spacing w:lineRule="auto" w:line="240" w:before="0" w:after="200"/>
         <w:jc w:val="center"/>
         <w:rPr>
-          <w:rFonts w:eastAsia="TH SarabunPSK"/>
-          <w:b/>
-          <w:bCs/>
-          <w:sz w:val="36"/>
-          <w:szCs w:val="36"/>
-        </w:rPr>
-      </w:pPr>
-      <w:r>
-        <w:rPr>
-          <w:rFonts w:eastAsia="TH SarabunPSK"/>
-          <w:b/>
-          <w:bCs/>
-          <w:sz w:val="36"/>
-          <w:szCs w:val="36"/>
-        </w:rPr>
-      </w:r>
-    </w:p>
-    <w:p>
-      <w:pPr>
-        <w:pStyle w:val="Normal"/>
-        <w:spacing w:lineRule="auto" w:line="240" w:before="0" w:after="200"/>
-        <w:jc w:val="center"/>
-        <w:rPr>
           <w:sz w:val="36"/>
           <w:szCs w:val="36"/>
         </w:rPr>
@@ -2218,6 +2221,7 @@
       <w:pPr>
         <w:pStyle w:val="Heading1"/>
         <w:spacing w:lineRule="auto" w:line="240" w:before="360" w:after="200"/>
+        <w:jc w:val="center"/>
         <w:rPr/>
       </w:pPr>
       <w:bookmarkStart w:id="1" w:name="_TocContents"/>
@@ -6412,7 +6416,7 @@
           <w:sz w:val="32"/>
           <w:szCs w:val="32"/>
         </w:rPr>
-        <w:t xml:space="preserve">(mojito/minimal.py) </w:t>
+        <w:t xml:space="preserve">(minimal.py) </w:t>
       </w:r>
       <w:r>
         <w:rPr>

</xml_diff>